<commit_message>
created user, wallet, payment routes and schemas
</commit_message>
<xml_diff>
--- a/BIOPAY.docx
+++ b/BIOPAY.docx
@@ -399,21 +399,7 @@
           <w:b/>
           <w:bCs/>
         </w:rPr>
-        <w:t xml:space="preserve">Workflow Diagram for </w:t>
-      </w:r>
-      <w:r>
-        <w:rPr>
-          <w:b/>
-          <w:bCs/>
-        </w:rPr>
-        <w:t>Biometric Enrolment</w:t>
-      </w:r>
-      <w:r>
-        <w:rPr>
-          <w:b/>
-          <w:bCs/>
-        </w:rPr>
-        <w:t>:</w:t>
+        <w:t>Workflow Diagram for Biometric Enrolment:</w:t>
       </w:r>
     </w:p>
     <w:p>
@@ -655,7 +641,7 @@
         <mc:AlternateContent>
           <mc:Choice Requires="wps">
             <w:drawing>
-              <wp:anchor distT="0" distB="0" distL="114300" distR="114300" simplePos="0" relativeHeight="251667456" behindDoc="0" locked="0" layoutInCell="1" allowOverlap="1" wp14:anchorId="7AB29217" wp14:editId="52842BEF">
+              <wp:anchor distT="0" distB="0" distL="114300" distR="114300" simplePos="0" relativeHeight="251667456" behindDoc="0" locked="0" layoutInCell="1" allowOverlap="1" wp14:anchorId="7AB29217" wp14:editId="2C027A8C">
                 <wp:simplePos x="0" y="0"/>
                 <wp:positionH relativeFrom="margin">
                   <wp:align>left</wp:align>
@@ -732,7 +718,7 @@
           </mc:Choice>
           <mc:Fallback>
             <w:pict>
-              <v:rect w14:anchorId="7F8CE4C6" id="Rectangle 6" o:spid="_x0000_s1026" style="position:absolute;margin-left:0;margin-top:17.4pt;width:438pt;height:318pt;z-index:251667456;visibility:visible;mso-wrap-style:square;mso-height-percent:0;mso-wrap-distance-left:9pt;mso-wrap-distance-top:0;mso-wrap-distance-right:9pt;mso-wrap-distance-bottom:0;mso-position-horizontal:left;mso-position-horizontal-relative:margin;mso-position-vertical:absolute;mso-position-vertical-relative:text;mso-height-percent:0;mso-height-relative:margin;v-text-anchor:middle" o:gfxdata="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" strokecolor="black [3213]" strokeweight="1pt">
+              <v:rect w14:anchorId="75C8B76A" id="Rectangle 6" o:spid="_x0000_s1026" style="position:absolute;margin-left:0;margin-top:17.4pt;width:438pt;height:318pt;z-index:251667456;visibility:visible;mso-wrap-style:square;mso-height-percent:0;mso-wrap-distance-left:9pt;mso-wrap-distance-top:0;mso-wrap-distance-right:9pt;mso-wrap-distance-bottom:0;mso-position-horizontal:left;mso-position-horizontal-relative:margin;mso-position-vertical:absolute;mso-position-vertical-relative:text;mso-height-percent:0;mso-height-relative:margin;v-text-anchor:middle" o:gfxdata="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" strokecolor="black [3213]" strokeweight="1pt">
                 <v:fill r:id="rId11" o:title="" recolor="t" rotate="t" type="frame"/>
                 <w10:wrap anchorx="margin"/>
               </v:rect>
@@ -847,6 +833,240 @@
           <w:bCs/>
         </w:rPr>
       </w:pPr>
+      <w:r>
+        <w:rPr>
+          <w:b/>
+          <w:bCs/>
+        </w:rPr>
+        <w:tab/>
+      </w:r>
+    </w:p>
+    <w:p>
+      <w:pPr>
+        <w:rPr>
+          <w:b/>
+          <w:bCs/>
+        </w:rPr>
+      </w:pPr>
+    </w:p>
+    <w:p>
+      <w:pPr>
+        <w:rPr>
+          <w:b/>
+          <w:bCs/>
+        </w:rPr>
+      </w:pPr>
+    </w:p>
+    <w:p>
+      <w:pPr>
+        <w:rPr>
+          <w:b/>
+          <w:bCs/>
+        </w:rPr>
+      </w:pPr>
+    </w:p>
+    <w:p>
+      <w:pPr>
+        <w:rPr>
+          <w:b/>
+          <w:bCs/>
+        </w:rPr>
+      </w:pPr>
+    </w:p>
+    <w:p>
+      <w:pPr>
+        <w:rPr>
+          <w:b/>
+          <w:bCs/>
+        </w:rPr>
+      </w:pPr>
+    </w:p>
+    <w:p>
+      <w:pPr>
+        <w:rPr>
+          <w:b/>
+          <w:bCs/>
+        </w:rPr>
+      </w:pPr>
+    </w:p>
+    <w:p>
+      <w:pPr>
+        <w:rPr>
+          <w:b/>
+          <w:bCs/>
+        </w:rPr>
+      </w:pPr>
+    </w:p>
+    <w:p>
+      <w:pPr>
+        <w:rPr>
+          <w:b/>
+          <w:bCs/>
+        </w:rPr>
+      </w:pPr>
+    </w:p>
+    <w:p>
+      <w:pPr>
+        <w:rPr>
+          <w:b/>
+          <w:bCs/>
+        </w:rPr>
+      </w:pPr>
+    </w:p>
+    <w:p>
+      <w:pPr>
+        <w:rPr>
+          <w:b/>
+          <w:bCs/>
+        </w:rPr>
+      </w:pPr>
+    </w:p>
+    <w:p>
+      <w:pPr>
+        <w:rPr>
+          <w:b/>
+          <w:bCs/>
+        </w:rPr>
+      </w:pPr>
+    </w:p>
+    <w:p>
+      <w:pPr>
+        <w:rPr>
+          <w:b/>
+          <w:bCs/>
+        </w:rPr>
+      </w:pPr>
+    </w:p>
+    <w:p>
+      <w:pPr>
+        <w:rPr>
+          <w:b/>
+          <w:bCs/>
+        </w:rPr>
+      </w:pPr>
+    </w:p>
+    <w:p>
+      <w:pPr>
+        <w:rPr>
+          <w:b/>
+          <w:bCs/>
+        </w:rPr>
+      </w:pPr>
+    </w:p>
+    <w:p>
+      <w:pPr>
+        <w:rPr>
+          <w:b/>
+          <w:bCs/>
+        </w:rPr>
+      </w:pPr>
+      <w:r>
+        <w:rPr>
+          <w:b/>
+          <w:bCs/>
+        </w:rPr>
+        <w:t>Use Case Diagram:</w:t>
+      </w:r>
+    </w:p>
+    <w:p>
+      <w:pPr>
+        <w:rPr>
+          <w:b/>
+          <w:bCs/>
+        </w:rPr>
+      </w:pPr>
+      <w:r>
+        <w:rPr>
+          <w:noProof/>
+        </w:rPr>
+        <mc:AlternateContent>
+          <mc:Choice Requires="wps">
+            <w:drawing>
+              <wp:anchor distT="0" distB="0" distL="114300" distR="114300" simplePos="0" relativeHeight="251669504" behindDoc="0" locked="0" layoutInCell="1" allowOverlap="1" wp14:anchorId="1A8F3120" wp14:editId="714A1D4F">
+                <wp:simplePos x="0" y="0"/>
+                <wp:positionH relativeFrom="margin">
+                  <wp:align>left</wp:align>
+                </wp:positionH>
+                <wp:positionV relativeFrom="paragraph">
+                  <wp:posOffset>43815</wp:posOffset>
+                </wp:positionV>
+                <wp:extent cx="5562600" cy="4038600"/>
+                <wp:effectExtent l="0" t="0" r="19050" b="19050"/>
+                <wp:wrapNone/>
+                <wp:docPr id="5" name="Rectangle 5"/>
+                <wp:cNvGraphicFramePr/>
+                <a:graphic xmlns:a="http://schemas.openxmlformats.org/drawingml/2006/main">
+                  <a:graphicData uri="http://schemas.microsoft.com/office/word/2010/wordprocessingShape">
+                    <wps:wsp>
+                      <wps:cNvSpPr/>
+                      <wps:spPr>
+                        <a:xfrm>
+                          <a:off x="0" y="0"/>
+                          <a:ext cx="5562600" cy="4038600"/>
+                        </a:xfrm>
+                        <a:prstGeom prst="rect">
+                          <a:avLst/>
+                        </a:prstGeom>
+                        <a:blipFill dpi="0" rotWithShape="1">
+                          <a:blip r:embed="rId12">
+                            <a:extLst>
+                              <a:ext uri="{28A0092B-C50C-407E-A947-70E740481C1C}">
+                                <a14:useLocalDpi xmlns:a14="http://schemas.microsoft.com/office/drawing/2010/main" val="0"/>
+                              </a:ext>
+                            </a:extLst>
+                          </a:blip>
+                          <a:srcRect/>
+                          <a:stretch>
+                            <a:fillRect/>
+                          </a:stretch>
+                        </a:blipFill>
+                        <a:ln>
+                          <a:solidFill>
+                            <a:schemeClr val="tx1"/>
+                          </a:solidFill>
+                        </a:ln>
+                      </wps:spPr>
+                      <wps:style>
+                        <a:lnRef idx="2">
+                          <a:schemeClr val="accent1">
+                            <a:shade val="50000"/>
+                          </a:schemeClr>
+                        </a:lnRef>
+                        <a:fillRef idx="1">
+                          <a:schemeClr val="accent1"/>
+                        </a:fillRef>
+                        <a:effectRef idx="0">
+                          <a:schemeClr val="accent1"/>
+                        </a:effectRef>
+                        <a:fontRef idx="minor">
+                          <a:schemeClr val="lt1"/>
+                        </a:fontRef>
+                      </wps:style>
+                      <wps:bodyPr rot="0" spcFirstLastPara="0" vertOverflow="overflow" horzOverflow="overflow" vert="horz" wrap="square" lIns="91440" tIns="45720" rIns="91440" bIns="45720" numCol="1" spcCol="0" rtlCol="0" fromWordArt="0" anchor="ctr" anchorCtr="0" forceAA="0" compatLnSpc="1">
+                        <a:prstTxWarp prst="textNoShape">
+                          <a:avLst/>
+                        </a:prstTxWarp>
+                        <a:noAutofit/>
+                      </wps:bodyPr>
+                    </wps:wsp>
+                  </a:graphicData>
+                </a:graphic>
+                <wp14:sizeRelV relativeFrom="margin">
+                  <wp14:pctHeight>0</wp14:pctHeight>
+                </wp14:sizeRelV>
+              </wp:anchor>
+            </w:drawing>
+          </mc:Choice>
+          <mc:Fallback>
+            <w:pict>
+              <v:rect w14:anchorId="1D2CF1A8" id="Rectangle 5" o:spid="_x0000_s1026" style="position:absolute;margin-left:0;margin-top:3.45pt;width:438pt;height:318pt;z-index:251669504;visibility:visible;mso-wrap-style:square;mso-height-percent:0;mso-wrap-distance-left:9pt;mso-wrap-distance-top:0;mso-wrap-distance-right:9pt;mso-wrap-distance-bottom:0;mso-position-horizontal:left;mso-position-horizontal-relative:margin;mso-position-vertical:absolute;mso-position-vertical-relative:text;mso-height-percent:0;mso-height-relative:margin;v-text-anchor:middle" o:gfxdata="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" strokecolor="black [3213]" strokeweight="1pt">
+                <v:fill r:id="rId13" o:title="" recolor="t" rotate="t" type="frame"/>
+                <w10:wrap anchorx="margin"/>
+              </v:rect>
+            </w:pict>
+          </mc:Fallback>
+        </mc:AlternateContent>
+      </w:r>
     </w:p>
     <w:sectPr>
       <w:pgSz w:w="11906" w:h="16838"/>

</xml_diff>